<commit_message>
model changed used qwen and removed unnecessary files
</commit_message>
<xml_diff>
--- a/docs/VoiceTrack_Project_Documentation.docx
+++ b/docs/VoiceTrack_Project_Documentation.docx
@@ -282,7 +282,7 @@
               <w:rPr>
                 <w:sz w:val="19"/>
               </w:rPr>
-              <w:t>28 June 2026</w:t>
+              <w:t>29 June 2026</w:t>
             </w:r>
           </w:p>
         </w:tc>
@@ -1591,54 +1591,6 @@
               <w:rPr>
                 <w:sz w:val="19"/>
               </w:rPr>
-              <w:t>voicetrack/constants.py</w:t>
-            </w:r>
-          </w:p>
-        </w:tc>
-        <w:tc>
-          <w:tcPr>
-            <w:tcW w:type="dxa" w:w="6860"/>
-            <w:tcMar>
-              <w:top w:w="80" w:type="dxa"/>
-              <w:bottom w:w="80" w:type="dxa"/>
-              <w:start w:w="120" w:type="dxa"/>
-              <w:end w:w="120" w:type="dxa"/>
-            </w:tcMar>
-            <w:vAlign w:val="center"/>
-          </w:tcPr>
-          <w:p>
-            <w:pPr>
-              <w:spacing w:after="0"/>
-            </w:pPr>
-            <w:r>
-              <w:rPr>
-                <w:sz w:val="19"/>
-              </w:rPr>
-              <w:t>Stores fixed categories, transaction types, and dark/light theme colors.</w:t>
-            </w:r>
-          </w:p>
-        </w:tc>
-      </w:tr>
-      <w:tr>
-        <w:tc>
-          <w:tcPr>
-            <w:tcW w:type="dxa" w:w="2500"/>
-            <w:tcMar>
-              <w:top w:w="80" w:type="dxa"/>
-              <w:bottom w:w="80" w:type="dxa"/>
-              <w:start w:w="120" w:type="dxa"/>
-              <w:end w:w="120" w:type="dxa"/>
-            </w:tcMar>
-            <w:vAlign w:val="center"/>
-          </w:tcPr>
-          <w:p>
-            <w:pPr>
-              <w:spacing w:after="0"/>
-            </w:pPr>
-            <w:r>
-              <w:rPr>
-                <w:sz w:val="19"/>
-              </w:rPr>
               <w:t>voicetrack/db.py</w:t>
             </w:r>
           </w:p>
@@ -1687,7 +1639,7 @@
               <w:rPr>
                 <w:sz w:val="19"/>
               </w:rPr>
-              <w:t>voicetrack/dates.py</w:t>
+              <w:t>voicetrack/extractor.py</w:t>
             </w:r>
           </w:p>
         </w:tc>
@@ -1710,7 +1662,7 @@
               <w:rPr>
                 <w:sz w:val="19"/>
               </w:rPr>
-              <w:t>Converts words like yesterday or last week into real dates such as 2026-06-27.</w:t>
+              <w:t>Active natural-language pipeline: Qwen extractor first, orchestrator validator second, fallback only if Ollama fails.</w:t>
             </w:r>
           </w:p>
         </w:tc>
@@ -1735,7 +1687,7 @@
               <w:rPr>
                 <w:sz w:val="19"/>
               </w:rPr>
-              <w:t>voicetrack/extractors.py</w:t>
+              <w:t>voicetrack/prompts.py</w:t>
             </w:r>
           </w:p>
         </w:tc>
@@ -1758,7 +1710,7 @@
               <w:rPr>
                 <w:sz w:val="19"/>
               </w:rPr>
-              <w:t>Talks to Ollama and parses JSON. If Ollama fails, it uses a simple local fallback parser.</w:t>
+              <w:t>Stores the extractor and orchestrator prompts used by the local LLM.</w:t>
             </w:r>
           </w:p>
         </w:tc>
@@ -1783,7 +1735,7 @@
               <w:rPr>
                 <w:sz w:val="19"/>
               </w:rPr>
-              <w:t>voicetrack/pipeline.py</w:t>
+              <w:t>voicetrack/fallback.py</w:t>
             </w:r>
           </w:p>
         </w:tc>
@@ -1806,7 +1758,7 @@
               <w:rPr>
                 <w:sz w:val="19"/>
               </w:rPr>
-              <w:t>Validates extracted data, fills missing date/time, normalizes category, and saves safe transactions.</w:t>
+              <w:t>Last-resort local parser used only when Ollama is unavailable or times out.</w:t>
             </w:r>
           </w:p>
         </w:tc>
@@ -1831,7 +1783,7 @@
               <w:rPr>
                 <w:sz w:val="19"/>
               </w:rPr>
-              <w:t>voicetrack/speech.py</w:t>
+              <w:t>voicetrack/voice.py</w:t>
             </w:r>
           </w:p>
         </w:tc>
@@ -1854,7 +1806,55 @@
               <w:rPr>
                 <w:sz w:val="19"/>
               </w:rPr>
-              <w:t>Captures microphone audio with sounddevice and converts speech to text using Vosk.</w:t>
+              <w:t>Captures microphone audio and converts speech to text using the offline Vosk model.</w:t>
+            </w:r>
+          </w:p>
+        </w:tc>
+      </w:tr>
+      <w:tr>
+        <w:tc>
+          <w:tcPr>
+            <w:tcW w:type="dxa" w:w="2500"/>
+            <w:tcMar>
+              <w:top w:w="80" w:type="dxa"/>
+              <w:bottom w:w="80" w:type="dxa"/>
+              <w:start w:w="120" w:type="dxa"/>
+              <w:end w:w="120" w:type="dxa"/>
+            </w:tcMar>
+            <w:vAlign w:val="center"/>
+          </w:tcPr>
+          <w:p>
+            <w:pPr>
+              <w:spacing w:after="0"/>
+            </w:pPr>
+            <w:r>
+              <w:rPr>
+                <w:sz w:val="19"/>
+              </w:rPr>
+              <w:t>voicetrack/charts.py</w:t>
+            </w:r>
+          </w:p>
+        </w:tc>
+        <w:tc>
+          <w:tcPr>
+            <w:tcW w:type="dxa" w:w="6860"/>
+            <w:tcMar>
+              <w:top w:w="80" w:type="dxa"/>
+              <w:bottom w:w="80" w:type="dxa"/>
+              <w:start w:w="120" w:type="dxa"/>
+              <w:end w:w="120" w:type="dxa"/>
+            </w:tcMar>
+            <w:vAlign w:val="center"/>
+          </w:tcPr>
+          <w:p>
+            <w:pPr>
+              <w:spacing w:after="0"/>
+            </w:pPr>
+            <w:r>
+              <w:rPr>
+                <w:sz w:val="19"/>
+              </w:rPr>
+              <w:t>Draws dashboard and report charts with matplotlib.</w:t>
             </w:r>
           </w:p>
         </w:tc>
@@ -1927,7 +1927,7 @@
               <w:rPr>
                 <w:sz w:val="19"/>
               </w:rPr>
-              <w:t>tests/test_pipeline.py</w:t>
+              <w:t>tests/test_extractor.py</w:t>
             </w:r>
           </w:p>
         </w:tc>
@@ -1950,7 +1950,103 @@
               <w:rPr>
                 <w:sz w:val="19"/>
               </w:rPr>
-              <w:t>Automated tests that check the main transaction flow without needing Ollama or a microphone.</w:t>
+              <w:t>Tests the extractor/orchestrator flow with fake Ollama responses.</w:t>
+            </w:r>
+          </w:p>
+        </w:tc>
+      </w:tr>
+      <w:tr>
+        <w:tc>
+          <w:tcPr>
+            <w:tcW w:type="dxa" w:w="2500"/>
+            <w:tcMar>
+              <w:top w:w="80" w:type="dxa"/>
+              <w:bottom w:w="80" w:type="dxa"/>
+              <w:start w:w="120" w:type="dxa"/>
+              <w:end w:w="120" w:type="dxa"/>
+            </w:tcMar>
+            <w:vAlign w:val="center"/>
+          </w:tcPr>
+          <w:p>
+            <w:pPr>
+              <w:spacing w:after="0"/>
+            </w:pPr>
+            <w:r>
+              <w:rPr>
+                <w:sz w:val="19"/>
+              </w:rPr>
+              <w:t>tests/test_fallback.py</w:t>
+            </w:r>
+          </w:p>
+        </w:tc>
+        <w:tc>
+          <w:tcPr>
+            <w:tcW w:type="dxa" w:w="6860"/>
+            <w:tcMar>
+              <w:top w:w="80" w:type="dxa"/>
+              <w:bottom w:w="80" w:type="dxa"/>
+              <w:start w:w="120" w:type="dxa"/>
+              <w:end w:w="120" w:type="dxa"/>
+            </w:tcMar>
+            <w:vAlign w:val="center"/>
+          </w:tcPr>
+          <w:p>
+            <w:pPr>
+              <w:spacing w:after="0"/>
+            </w:pPr>
+            <w:r>
+              <w:rPr>
+                <w:sz w:val="19"/>
+              </w:rPr>
+              <w:t>Tests the last-resort fallback parser.</w:t>
+            </w:r>
+          </w:p>
+        </w:tc>
+      </w:tr>
+      <w:tr>
+        <w:tc>
+          <w:tcPr>
+            <w:tcW w:type="dxa" w:w="2500"/>
+            <w:tcMar>
+              <w:top w:w="80" w:type="dxa"/>
+              <w:bottom w:w="80" w:type="dxa"/>
+              <w:start w:w="120" w:type="dxa"/>
+              <w:end w:w="120" w:type="dxa"/>
+            </w:tcMar>
+            <w:vAlign w:val="center"/>
+          </w:tcPr>
+          <w:p>
+            <w:pPr>
+              <w:spacing w:after="0"/>
+            </w:pPr>
+            <w:r>
+              <w:rPr>
+                <w:sz w:val="19"/>
+              </w:rPr>
+              <w:t>tests/test_db.py</w:t>
+            </w:r>
+          </w:p>
+        </w:tc>
+        <w:tc>
+          <w:tcPr>
+            <w:tcW w:type="dxa" w:w="6860"/>
+            <w:tcMar>
+              <w:top w:w="80" w:type="dxa"/>
+              <w:bottom w:w="80" w:type="dxa"/>
+              <w:start w:w="120" w:type="dxa"/>
+              <w:end w:w="120" w:type="dxa"/>
+            </w:tcMar>
+            <w:vAlign w:val="center"/>
+          </w:tcPr>
+          <w:p>
+            <w:pPr>
+              <w:spacing w:after="0"/>
+            </w:pPr>
+            <w:r>
+              <w:rPr>
+                <w:sz w:val="19"/>
+              </w:rPr>
+              <w:t>Tests SQLite creation, insert, read, summary, category totals, and delete.</w:t>
             </w:r>
           </w:p>
         </w:tc>
@@ -2261,7 +2357,7 @@
         <w:ind w:left="540" w:hanging="271"/>
       </w:pPr>
       <w:r>
-        <w:t>The UI sends the text to TransactionPipeline.preview().</w:t>
+        <w:t>The UI sends the text to extractor.extract().</w:t>
       </w:r>
     </w:p>
     <w:p>
@@ -2271,7 +2367,7 @@
         <w:ind w:left="540" w:hanging="271"/>
       </w:pPr>
       <w:r>
-        <w:t>The pipeline asks the extractor to understand the sentence.</w:t>
+        <w:t>The first Qwen/Ollama call extracts transaction JSON.</w:t>
       </w:r>
     </w:p>
     <w:p>
@@ -2281,7 +2377,7 @@
         <w:ind w:left="540" w:hanging="271"/>
       </w:pPr>
       <w:r>
-        <w:t>Ollama returns JSON. If Ollama is too slow or fails, the local fallback parser tries simple extraction.</w:t>
+        <w:t>The orchestrator prompt receives the original sentence and that JSON, then corrects mistakes.</w:t>
       </w:r>
     </w:p>
     <w:p>
@@ -2291,7 +2387,7 @@
         <w:ind w:left="540" w:hanging="271"/>
       </w:pPr>
       <w:r>
-        <w:t>The pipeline checks the data: amount must exist, type must be income or expense, category must be valid, and date/time are normalized.</w:t>
+        <w:t>If Ollama is unavailable or times out, fallback.py is used as a low-confidence safety net.</w:t>
       </w:r>
     </w:p>
     <w:p>
@@ -2301,17 +2397,7 @@
         <w:ind w:left="540" w:hanging="271"/>
       </w:pPr>
       <w:r>
-        <w:t>The preview appears so the user can review or edit fields.</w:t>
-      </w:r>
-    </w:p>
-    <w:p>
-      <w:pPr>
-        <w:pStyle w:val="ListNumber"/>
-        <w:spacing w:after="80" w:line="300" w:lineRule="auto"/>
-        <w:ind w:left="540" w:hanging="271"/>
-      </w:pPr>
-      <w:r>
-        <w:t>User clicks Confirm.</w:t>
+        <w:t>The final transaction rows are saved into SQLite.</w:t>
       </w:r>
     </w:p>
     <w:p>

</xml_diff>